<commit_message>
docs+results: cierre del experimento — dataset final S1, hallazgos operativos del free tier
Articulo: Tabla 3 final (100/1000 x3), punto de quiebre localizado en 1000 VUs
(plano tiempo real, H4 confirmada), seccion 5.4 nueva con los 4 hallazgos
operativos (egreso+gzip -89.6% medido, pausa por inactividad, creditos burst
de la BD, cold starts 10-14s), Discusion y Conclusiones completas, trabajo
relacionado y referencias APA cerradas.

Protocolo v2: seccion 7.3 reescrita al alcance ejecutado (2500/5000 = trabajo
futuro con causa documentada; corridas del 13-jul excluidas por criterio
predefinido).

Resultados: 3 corridas del 13-jul (excluidas del dataset, conservadas como
evidencia de los incidentes) + bitacora matriz.log con el diagnostico completo.
</commit_message>
<xml_diff>
--- a/Documentos/Protocolo de Investigacion - APA7 - v2 corregido.docx
+++ b/Documentos/Protocolo de Investigacion - APA7 - v2 corregido.docx
@@ -6490,6 +6490,35 @@
     </w:p>
     <w:p>
       <w:pPr>
+        <w:spacing w:after="120" w:before="0" w:line="276" w:lineRule="auto"/>
+      </w:pPr>
+      <w:r>
+        <w:rPr>
+          <w:rFonts w:ascii="Times New Roman" w:cs="Times New Roman" w:eastAsia="Times New Roman" w:hAnsi="Times New Roman"/>
+          <w:b/>
+          <w:bCs/>
+          <w:i w:val="false"/>
+          <w:iCs w:val="false"/>
+          <w:sz w:val="24"/>
+          <w:szCs w:val="24"/>
+        </w:rPr>
+        <w:t xml:space="preserve">Alcance ejecutado: </w:t>
+      </w:r>
+      <w:r>
+        <w:rPr>
+          <w:rFonts w:ascii="Times New Roman" w:cs="Times New Roman" w:eastAsia="Times New Roman" w:hAnsi="Times New Roman"/>
+          <w:b w:val="false"/>
+          <w:bCs w:val="false"/>
+          <w:i w:val="false"/>
+          <w:iCs w:val="false"/>
+          <w:sz w:val="24"/>
+          <w:szCs w:val="24"/>
+        </w:rPr>
+        <w:t xml:space="preserve">los niveles 100 y 1 000 se completaron (3 réplicas cada uno, 6/6 válidas). Los niveles 2 500 y 5 000 no se ejecutaron por las restricciones operativas documentadas en §7.3 y se declaran trabajo futuro; el punto de quiebre quedó localizado dentro del alcance ejecutado.</w:t>
+      </w:r>
+    </w:p>
+    <w:p>
+      <w:pPr>
         <w:pStyle w:val="Heading2"/>
         <w:spacing w:after="120" w:before="220"/>
       </w:pPr>
@@ -8839,7 +8868,7 @@
           <w:sz w:val="26"/>
           <w:szCs w:val="26"/>
         </w:rPr>
-        <w:t xml:space="preserve">7.3 Nota de re-ejecución, corrida puente y hallazgo sobre cuotas</w:t>
+        <w:t xml:space="preserve">7.3 Alcance ejecutado, incidentes operativos y cierre del dataset</w:t>
       </w:r>
     </w:p>
     <w:p>
@@ -8856,7 +8885,7 @@
           <w:sz w:val="24"/>
           <w:szCs w:val="24"/>
         </w:rPr>
-        <w:t xml:space="preserve">Tras la primera sesión, el experimento agotó la cuota mensual de transferencia de la capa gratuita (5 GB de egreso por cuenta) en las cuentas del api-gateway y de groups-service, lo que suspendió los servicios. Esto motivó dos ajustes documentados: (a) habilitar compresión gzip en las respuestas de los servicios —los payloads JSON viajaban sin comprimir; la compresión reduce el egreso en ~80 %— y (b) re-desplegar los cuatro servicios en cuentas nuevas, del mismo tipo de instancia y región. La ejecución de la matriz queda por tanto dividida en dos sesiones con condiciones de despliegue distintas (sesión 1: sin compresión, cuentas originales; sesión 2: con compresión, cuentas nuevas).</w:t>
+        <w:t xml:space="preserve">Tras la primera sesión, el experimento agotó la cuota mensual de transferencia de la capa gratuita (5 GB de egreso por cuenta) en las cuentas del api-gateway y de groups-service, lo que suspendió los servicios. Esto motivó dos ajustes documentados: (a) habilitar compresión gzip en las respuestas —los payloads JSON viajaban sin comprimir; la reducción medida en el cable fue de −89.6 % (270 788 → 28 114 bytes)— y (b) re-desplegar los cuatro servicios en cuentas nuevas del mismo tipo de instancia y región.</w:t>
       </w:r>
     </w:p>
     <w:p>
@@ -8873,7 +8902,24 @@
           <w:sz w:val="24"/>
           <w:szCs w:val="24"/>
         </w:rPr>
-        <w:t xml:space="preserve">Para validar la comparabilidad entre ambas sesiones sin exceder el presupuesto de egreso disponible (cuatro cuentas de 5 GB, sin cuentas de reserva), la sesión 2 ejecuta primero una corrida puente en el nivel de 1 000 VUs sobre el despliegue nuevo, con criterio predefinido: si su P95 HTTP y su tasa de conexiones WS caídas caen dentro del rango mínimo–máximo de las tres réplicas de la sesión 1 ampliado en ±10 % (P95: 955–1 138 ms; caídas: 23.59–24.16 %), se declara la comparabilidad y la curva completa integra ambas sesiones, documentando el puente; si divergen materialmente, los resultados oficiales se limitan a la curva del despliegue nuevo y la sesión 1 se reporta como piloto extendido. A continuación se ejecutan los niveles 2 500 y 5 000 (tres réplicas cada uno). Presupuesto estimado de la sesión 2: siete corridas × ~0.6 GB ≈ 4.2 GB en la cuenta del gateway y ~3.9 GB en la de groups, con margen para repetir una corrida inválida; la corrida puente sirve además como verificación empírica del egreso por corrida antes de comprometer los niveles altos. El episodio de la cuota se documenta, junto con la mitigación por compresión, como hallazgo del estudio sobre las restricciones operativas de la capa gratuita.</w:t>
+        <w:t xml:space="preserve">La re-validación sobre el despliegue nuevo (corrida puente a 1 000 VUs, con criterio de comparabilidad predefinido contra la sesión 1) se intentó dos veces el 2026-07-13 y colapsó en ambas (87–88 % de conexiones WS caídas) con una firma de inanición de E/S en la capa de datos: memoria del servicio de grupos al tope (518 de 512 MB) con CPU casi ociosa (0.009–0.026 núcleos, contra 0.135 en la sesión 1 sana), pool de conexiones saturado y tormenta de reconexiones. El diagnóstico —documentado en la bitácora con la evidencia de descarte de causas alternativas (modo de pooling, costo de CPU de la compresión, estado de la base en reposo)— atribuye el colapso al estado de los créditos de ráfaga de la instancia de base de datos del plan gratuito (t3a.nano), agotados tras la restauración del proyecto (que había sido pausado por inactividad) y las corridas consecutivas del mismo día. Ambas corridas se excluyeron del dataset por criterio predefinido (§6.2: interferencia registrada, decidida por causa asignable y no por el valor de las métricas).</w:t>
+      </w:r>
+    </w:p>
+    <w:p>
+      <w:pPr>
+        <w:spacing w:after="120" w:before="0" w:line="276" w:lineRule="auto"/>
+      </w:pPr>
+      <w:r>
+        <w:rPr>
+          <w:rFonts w:ascii="Times New Roman" w:cs="Times New Roman" w:eastAsia="Times New Roman" w:hAnsi="Times New Roman"/>
+          <w:b w:val="false"/>
+          <w:bCs w:val="false"/>
+          <w:i w:val="false"/>
+          <w:iCs w:val="false"/>
+          <w:sz w:val="24"/>
+          <w:szCs w:val="24"/>
+        </w:rPr>
+        <w:t xml:space="preserve">En consecuencia, el dataset del estudio se cierra con la sesión 1 (niveles 100 y 1 000, tres réplicas por nivel, 6/6 corridas válidas). El cierre es suficiente para contrastar las hipótesis: el punto de quiebre definido en §6.4 se localizó en el nivel de 1 000 VUs (mediana de conexiones WS caídas de 23.87 %, umbral &lt; 10 %), lo que confirma H4 con el matiz de que el quiebre llega por calidad de servicio del plano en tiempo real y no por agotamiento de memoria (46.6 % del límite en el peor servicio). Los niveles 2 500 y 5 000 —que caracterizarían el comportamiento posterior al quiebre, incluida la búsqueda del límite de memoria— se declaran trabajo futuro, con un plan de ejecución que administre los créditos de la capa de datos. Los incidentes operativos (cuota de egreso, pausa por inactividad, créditos de ráfaga, arranques en frío de 10–14 s medidos) se reportan como hallazgos del estudio sobre las restricciones de la capa gratuita.</w:t>
       </w:r>
     </w:p>
     <w:p>

</xml_diff>